<commit_message>
feat(academia): nueva seccion de cursos Power BI con 4 tiers + 12 materiales
</commit_message>
<xml_diff>
--- a/scorecard-General/PAGINA-2BI/academia/materiales/03_Express_Plan_Negocio.docx
+++ b/scorecard-General/PAGINA-2BI/academia/materiales/03_Express_Plan_Negocio.docx
@@ -2960,7 +2960,7 @@
           <w:sz w:val="22"/>
           <w:szCs w:val="22"/>
         </w:rPr>
-        <w:t xml:space="preserve">El funnel B2C del tier EXPRESS tiene un pipeline corto (1-3 semanas). Se optimiza con automatización n8n.</w:t>
+        <w:t xml:space="preserve">El funnel B2C del tier EXPRESS tiene un pipeline corto (1-3 semanas). Se optimiza con automatización Power BI Subscriptions.</w:t>
       </w:r>
     </w:p>
     <w:tbl>
@@ -3511,7 +3511,7 @@
                 <w:sz w:val="20"/>
                 <w:szCs w:val="20"/>
               </w:rPr>
-              <w:t xml:space="preserve">n8n + Mailchimp</w:t>
+              <w:t xml:space="preserve">Power BI Subscriptions + Mailchimp</w:t>
             </w:r>
           </w:p>
         </w:tc>
@@ -3688,7 +3688,7 @@
                 <w:sz w:val="20"/>
                 <w:szCs w:val="20"/>
               </w:rPr>
-              <w:t xml:space="preserve">n8n drip</w:t>
+              <w:t xml:space="preserve">Power BI Subscriptions drip</w:t>
             </w:r>
           </w:p>
         </w:tc>
@@ -4499,7 +4499,7 @@
           <w:sz w:val="36"/>
           <w:szCs w:val="36"/>
         </w:rPr>
-        <w:t xml:space="preserve">5. Automatización con n8n + AI</w:t>
+        <w:t xml:space="preserve">5. Automatización con Power BI Subscriptions + AI</w:t>
       </w:r>
     </w:p>
     <w:p>
@@ -4563,7 +4563,7 @@
           <w:sz w:val="22"/>
           <w:szCs w:val="22"/>
         </w:rPr>
-        <w:t xml:space="preserve">Webhook → n8n recibe email → valida con MX lookup → envía PDF cheat sheet → crea contacto en Notion CRM → inicia secuencia de 5 emails drip.</w:t>
+        <w:t xml:space="preserve">Webhook → Power BI Subscriptions recibe email → valida con MX lookup → envía PDF cheat sheet → crea contacto en Notion CRM → inicia secuencia de 5 emails drip.</w:t>
       </w:r>
     </w:p>
     <w:p>
@@ -4595,7 +4595,7 @@
           <w:sz w:val="22"/>
           <w:szCs w:val="22"/>
         </w:rPr>
-        <w:t xml:space="preserve">Calendly → webhook → n8n agrega evento al Google Calendar + envía email de confirmación con cuestionario diagnóstico (Tally) → 24 hrs antes manda reminder → al finalizar, dispara email de propuesta automática usando datos del cuestionario + LLM (Claude Sonnet) que personaliza el saludo.</w:t>
+        <w:t xml:space="preserve">Calendly → webhook → Power BI Subscriptions agrega evento al Google Calendar + envía email de confirmación con cuestionario diagnóstico (Tally) → 24 hrs antes manda reminder → al finalizar, dispara email de propuesta automática usando datos del cuestionario + LLM (Claude Sonnet) que personaliza el saludo.</w:t>
       </w:r>
     </w:p>
     <w:p>
@@ -4627,7 +4627,7 @@
           <w:sz w:val="22"/>
           <w:szCs w:val="22"/>
         </w:rPr>
-        <w:t xml:space="preserve">Pago confirmado en Stripe → n8n crea carpeta Drive → comparte plantillas → agrega a grupo WhatsApp → registra en Notion como 'Alumno Activo' → envía email de bienvenida con calendario.</w:t>
+        <w:t xml:space="preserve">Pago confirmado en Stripe → Power BI Subscriptions crea carpeta Drive → comparte plantillas → agrega a grupo WhatsApp → registra en Notion como 'Alumno Activo' → envía email de bienvenida con calendario.</w:t>
       </w:r>
     </w:p>
     <w:p>
@@ -4659,7 +4659,7 @@
           <w:sz w:val="22"/>
           <w:szCs w:val="22"/>
         </w:rPr>
-        <w:t xml:space="preserve">Cada lunes 8am: n8n consulta Notion CRM → calcula KPIs (leads, conversión, alumnos activos, ingreso semanal) → genera dashboard PNG → envía al WhatsApp del instructor con resumen.</w:t>
+        <w:t xml:space="preserve">Cada lunes 8am: Power BI Subscriptions consulta Notion CRM → calcula KPIs (leads, conversión, alumnos activos, ingreso semanal) → genera dashboard PNG → envía al WhatsApp del instructor con resumen.</w:t>
       </w:r>
     </w:p>
     <w:p>
@@ -4838,7 +4838,7 @@
                 <w:sz w:val="20"/>
                 <w:szCs w:val="20"/>
               </w:rPr>
-              <w:t xml:space="preserve">n8n self-hosted (Hetzner)</w:t>
+              <w:t xml:space="preserve">Power BI Subscriptions self-hosted (Hetzner)</w:t>
             </w:r>
           </w:p>
         </w:tc>
@@ -5301,7 +5301,7 @@
                 <w:sz w:val="20"/>
                 <w:szCs w:val="20"/>
               </w:rPr>
-              <w:t xml:space="preserve">Envío emails desde n8n</w:t>
+              <w:t xml:space="preserve">Envío emails desde Power BI Subscriptions</w:t>
             </w:r>
           </w:p>
         </w:tc>
@@ -5373,7 +5373,7 @@
                 <w:sz w:val="20"/>
                 <w:szCs w:val="20"/>
               </w:rPr>
-              <w:t xml:space="preserve">Anthropic Claude API</w:t>
+              <w:t xml:space="preserve">Smart Narrative API</w:t>
             </w:r>
           </w:p>
         </w:tc>
@@ -9523,7 +9523,7 @@
           <w:sz w:val="22"/>
           <w:szCs w:val="22"/>
         </w:rPr>
-        <w:t xml:space="preserve">[ ] n8n con flujo de captura B2C funcionando.</w:t>
+        <w:t xml:space="preserve">[ ] Power BI Subscriptions con flujo de captura B2C funcionando.</w:t>
       </w:r>
     </w:p>
     <w:p>

</xml_diff>